<commit_message>
Siste oppdatering før jeg leverer prosjektet.
</commit_message>
<xml_diff>
--- a/Vedlegg 1 - KI-deklarasjon/KI-deklarasjon for Avsluttende prosjekt.docx
+++ b/Vedlegg 1 - KI-deklarasjon/KI-deklarasjon for Avsluttende prosjekt.docx
@@ -621,13 +621,7 @@
               <w:rPr>
                 <w:rFonts w:asciiTheme="minorHAnsi" w:eastAsiaTheme="minorEastAsia" w:hAnsiTheme="minorHAnsi" w:cstheme="minorBidi"/>
               </w:rPr>
-              <w:t>Jeg har brukt KI til</w:t>
-            </w:r>
-            <w:r>
-              <w:rPr>
-                <w:rFonts w:asciiTheme="minorHAnsi" w:eastAsiaTheme="minorEastAsia" w:hAnsiTheme="minorHAnsi" w:cstheme="minorBidi"/>
-              </w:rPr>
-              <w:t xml:space="preserve"> å hjelpe meg og feilsøke på bash skript og dokumentere det</w:t>
+              <w:t>Jeg har brukt KI til å hjelpe meg og feilsøke på bash skript og dokumentere det</w:t>
             </w:r>
             <w:r>
               <w:br/>
@@ -748,13 +742,7 @@
               <w:rPr>
                 <w:rFonts w:asciiTheme="minorHAnsi" w:eastAsiaTheme="minorEastAsia" w:hAnsiTheme="minorHAnsi" w:cstheme="minorBidi"/>
               </w:rPr>
-              <w:t>Jeg brukte KI til å hjelpe meg</w:t>
-            </w:r>
-            <w:r>
-              <w:rPr>
-                <w:rFonts w:asciiTheme="minorHAnsi" w:eastAsiaTheme="minorEastAsia" w:hAnsiTheme="minorHAnsi" w:cstheme="minorBidi"/>
-              </w:rPr>
-              <w:t xml:space="preserve"> feilsøke på koden. Jeg testet den på min maskin.</w:t>
+              <w:t>Jeg brukte KI til å hjelpe meg feilsøke på koden. Jeg testet den på min maskin.</w:t>
             </w:r>
           </w:p>
           <w:p>
@@ -953,10 +941,73 @@
               </w:tabs>
             </w:pPr>
             <w:r>
+              <w:rPr>
+                <w:noProof/>
+              </w:rPr>
+              <w:drawing>
+                <wp:anchor distT="0" distB="0" distL="114300" distR="114300" simplePos="0" relativeHeight="251659264" behindDoc="0" locked="0" layoutInCell="1" allowOverlap="1" wp14:anchorId="7668F270" wp14:editId="67B78A95">
+                  <wp:simplePos x="0" y="0"/>
+                  <wp:positionH relativeFrom="column">
+                    <wp:posOffset>3495040</wp:posOffset>
+                  </wp:positionH>
+                  <wp:positionV relativeFrom="paragraph">
+                    <wp:posOffset>370205</wp:posOffset>
+                  </wp:positionV>
+                  <wp:extent cx="1390650" cy="425450"/>
+                  <wp:effectExtent l="0" t="0" r="0" b="0"/>
+                  <wp:wrapTopAndBottom/>
+                  <wp:docPr id="2137136112" name="Picture 1" descr="A close up of a letter&#10;&#10;AI-generated content may be incorrect."/>
+                  <wp:cNvGraphicFramePr>
+                    <a:graphicFrameLocks xmlns:a="http://schemas.openxmlformats.org/drawingml/2006/main" noChangeAspect="1"/>
+                  </wp:cNvGraphicFramePr>
+                  <a:graphic xmlns:a="http://schemas.openxmlformats.org/drawingml/2006/main">
+                    <a:graphicData uri="http://schemas.openxmlformats.org/drawingml/2006/picture">
+                      <pic:pic xmlns:pic="http://schemas.openxmlformats.org/drawingml/2006/picture">
+                        <pic:nvPicPr>
+                          <pic:cNvPr id="2137136112" name="Picture 1" descr="A close up of a letter&#10;&#10;AI-generated content may be incorrect."/>
+                          <pic:cNvPicPr/>
+                        </pic:nvPicPr>
+                        <pic:blipFill>
+                          <a:blip r:embed="rId11" cstate="print">
+                            <a:extLst>
+                              <a:ext uri="{28A0092B-C50C-407E-A947-70E740481C1C}">
+                                <a14:useLocalDpi xmlns:a14="http://schemas.microsoft.com/office/drawing/2010/main" val="0"/>
+                              </a:ext>
+                            </a:extLst>
+                          </a:blip>
+                          <a:stretch>
+                            <a:fillRect/>
+                          </a:stretch>
+                        </pic:blipFill>
+                        <pic:spPr>
+                          <a:xfrm>
+                            <a:off x="0" y="0"/>
+                            <a:ext cx="1390650" cy="425450"/>
+                          </a:xfrm>
+                          <a:prstGeom prst="rect">
+                            <a:avLst/>
+                          </a:prstGeom>
+                        </pic:spPr>
+                      </pic:pic>
+                    </a:graphicData>
+                  </a:graphic>
+                  <wp14:sizeRelH relativeFrom="margin">
+                    <wp14:pctWidth>0</wp14:pctWidth>
+                  </wp14:sizeRelH>
+                  <wp14:sizeRelV relativeFrom="margin">
+                    <wp14:pctHeight>0</wp14:pctHeight>
+                  </wp14:sizeRelV>
+                </wp:anchor>
+              </w:drawing>
+            </w:r>
+            <w:r>
               <w:tab/>
             </w:r>
             <w:r>
-              <w:t>16</w:t>
+              <w:t>1</w:t>
+            </w:r>
+            <w:r>
+              <w:t>8</w:t>
             </w:r>
             <w:r>
               <w:t>.</w:t>
@@ -971,11 +1022,23 @@
               <w:t>2025</w:t>
             </w:r>
             <w:r>
+              <w:t xml:space="preserve"> Fredrikstad</w:t>
+            </w:r>
+            <w:r>
               <w:tab/>
             </w:r>
             <w:r>
               <w:t>Espen Bø</w:t>
             </w:r>
+          </w:p>
+          <w:p>
+            <w:pPr>
+              <w:tabs>
+                <w:tab w:val="left" w:pos="427"/>
+                <w:tab w:val="left" w:pos="6217"/>
+                <w:tab w:val="left" w:pos="6408"/>
+              </w:tabs>
+            </w:pPr>
           </w:p>
           <w:p>
             <w:pPr>
@@ -2972,6 +3035,7 @@
   <w:style w:type="character" w:default="1" w:styleId="DefaultParagraphFont">
     <w:name w:val="Default Paragraph Font"/>
     <w:uiPriority w:val="1"/>
+    <w:semiHidden/>
     <w:unhideWhenUsed/>
   </w:style>
   <w:style w:type="table" w:default="1" w:styleId="TableNormal">
@@ -3382,6 +3446,21 @@
 </file>
 
 <file path=customXml/item1.xml><?xml version="1.0" encoding="utf-8"?>
+<p:properties xmlns:p="http://schemas.microsoft.com/office/2006/metadata/properties" xmlns:xsi="http://www.w3.org/2001/XMLSchema-instance" xmlns:pc="http://schemas.microsoft.com/office/infopath/2007/PartnerControls">
+  <documentManagement/>
+</p:properties>
+</file>
+
+<file path=customXml/item2.xml><?xml version="1.0" encoding="utf-8"?>
+<?mso-contentType ?>
+<FormTemplates xmlns="http://schemas.microsoft.com/sharepoint/v3/contenttype/forms">
+  <Display>DocumentLibraryForm</Display>
+  <Edit>DocumentLibraryForm</Edit>
+  <New>DocumentLibraryForm</New>
+</FormTemplates>
+</file>
+
+<file path=customXml/item3.xml><?xml version="1.0" encoding="utf-8"?>
 <ct:contentTypeSchema xmlns:ct="http://schemas.microsoft.com/office/2006/metadata/contentType" xmlns:ma="http://schemas.microsoft.com/office/2006/metadata/properties/metaAttributes" ct:_="" ma:_="" ma:contentTypeName="Document" ma:contentTypeID="0x0101006F52E1657A76FA4DBA1B1E88A16B2C35" ma:contentTypeVersion="9" ma:contentTypeDescription="Create a new document." ma:contentTypeScope="" ma:versionID="932a6cdf5021e19efe24503161b83c4e">
   <xsd:schema xmlns:xsd="http://www.w3.org/2001/XMLSchema" xmlns:xs="http://www.w3.org/2001/XMLSchema" xmlns:p="http://schemas.microsoft.com/office/2006/metadata/properties" xmlns:ns2="21e4407e-2d62-4fab-9459-6656a839dcca" targetNamespace="http://schemas.microsoft.com/office/2006/metadata/properties" ma:root="true" ma:fieldsID="8f7ccf0147be3ef7470fceae0aafe42b" ns2:_="">
     <xsd:import namespace="21e4407e-2d62-4fab-9459-6656a839dcca"/>
@@ -3557,22 +3636,24 @@
 </ct:contentTypeSchema>
 </file>
 
-<file path=customXml/item2.xml><?xml version="1.0" encoding="utf-8"?>
-<?mso-contentType ?>
-<FormTemplates xmlns="http://schemas.microsoft.com/sharepoint/v3/contenttype/forms">
-  <Display>DocumentLibraryForm</Display>
-  <Edit>DocumentLibraryForm</Edit>
-  <New>DocumentLibraryForm</New>
-</FormTemplates>
+<file path=customXml/itemProps1.xml><?xml version="1.0" encoding="utf-8"?>
+<ds:datastoreItem xmlns:ds="http://schemas.openxmlformats.org/officeDocument/2006/customXml" ds:itemID="{404EEE3A-6980-4788-AD9C-4AAA8E241FBC}">
+  <ds:schemaRefs>
+    <ds:schemaRef ds:uri="http://schemas.microsoft.com/office/2006/metadata/properties"/>
+    <ds:schemaRef ds:uri="http://schemas.microsoft.com/office/infopath/2007/PartnerControls"/>
+  </ds:schemaRefs>
+</ds:datastoreItem>
 </file>
 
-<file path=customXml/item3.xml><?xml version="1.0" encoding="utf-8"?>
-<p:properties xmlns:p="http://schemas.microsoft.com/office/2006/metadata/properties" xmlns:xsi="http://www.w3.org/2001/XMLSchema-instance" xmlns:pc="http://schemas.microsoft.com/office/infopath/2007/PartnerControls">
-  <documentManagement/>
-</p:properties>
+<file path=customXml/itemProps2.xml><?xml version="1.0" encoding="utf-8"?>
+<ds:datastoreItem xmlns:ds="http://schemas.openxmlformats.org/officeDocument/2006/customXml" ds:itemID="{9B464C54-08F0-4400-8570-BEA78A576750}">
+  <ds:schemaRefs>
+    <ds:schemaRef ds:uri="http://schemas.microsoft.com/sharepoint/v3/contenttype/forms"/>
+  </ds:schemaRefs>
+</ds:datastoreItem>
 </file>
 
-<file path=customXml/itemProps1.xml><?xml version="1.0" encoding="utf-8"?>
+<file path=customXml/itemProps3.xml><?xml version="1.0" encoding="utf-8"?>
 <ds:datastoreItem xmlns:ds="http://schemas.openxmlformats.org/officeDocument/2006/customXml" ds:itemID="{2703D0B3-D07C-412C-A8A8-D3C2E196D590}">
   <ds:schemaRefs>
     <ds:schemaRef ds:uri="http://schemas.microsoft.com/office/2006/metadata/contentType"/>
@@ -3588,21 +3669,4 @@
     <ds:schemaRef ds:uri="http://schemas.microsoft.com/internal/obd"/>
   </ds:schemaRefs>
 </ds:datastoreItem>
-</file>
-
-<file path=customXml/itemProps2.xml><?xml version="1.0" encoding="utf-8"?>
-<ds:datastoreItem xmlns:ds="http://schemas.openxmlformats.org/officeDocument/2006/customXml" ds:itemID="{9B464C54-08F0-4400-8570-BEA78A576750}">
-  <ds:schemaRefs>
-    <ds:schemaRef ds:uri="http://schemas.microsoft.com/sharepoint/v3/contenttype/forms"/>
-  </ds:schemaRefs>
-</ds:datastoreItem>
-</file>
-
-<file path=customXml/itemProps3.xml><?xml version="1.0" encoding="utf-8"?>
-<ds:datastoreItem xmlns:ds="http://schemas.openxmlformats.org/officeDocument/2006/customXml" ds:itemID="{404EEE3A-6980-4788-AD9C-4AAA8E241FBC}">
-  <ds:schemaRefs>
-    <ds:schemaRef ds:uri="http://schemas.microsoft.com/office/2006/metadata/properties"/>
-    <ds:schemaRef ds:uri="http://schemas.microsoft.com/office/infopath/2007/PartnerControls"/>
-  </ds:schemaRefs>
-</ds:datastoreItem>
 </file>
</xml_diff>